<commit_message>
Add shading fallback so card highlights render in every viewer
Co-Authored-By: Claude Opus 5.5 <noreply@anthropic.com>
Claude-Session: https://claude.ai/code/session_01FQsBKRU9kFf2tBVFNbBV4f
</commit_message>
<xml_diff>
--- a/debate/UNI-Aff-Hybrid-Case.docx
+++ b/debate/UNI-Aff-Hybrid-Case.docx
@@ -519,6 +519,7 @@
           <w:sz w:val="24"/>
           <w:highlight w:val="yellow"/>
           <w:u w:val="single"/>
+          <w:shd w:val="clear" w:color="auto" w:fill="FFFF00"/>
         </w:rPr>
         <w:t>in 2019</w:t>
       </w:r>
@@ -550,6 +551,7 @@
           <w:sz w:val="24"/>
           <w:highlight w:val="yellow"/>
           <w:u w:val="single"/>
+          <w:shd w:val="clear" w:color="auto" w:fill="FFFF00"/>
         </w:rPr>
         <w:t xml:space="preserve">moratorium </w:t>
       </w:r>
@@ -574,6 +576,7 @@
           <w:sz w:val="24"/>
           <w:highlight w:val="yellow"/>
           <w:u w:val="single"/>
+          <w:shd w:val="clear" w:color="auto" w:fill="FFFF00"/>
         </w:rPr>
         <w:t>caused</w:t>
       </w:r>
@@ -605,6 +608,7 @@
           <w:sz w:val="24"/>
           <w:highlight w:val="yellow"/>
           <w:u w:val="single"/>
+          <w:shd w:val="clear" w:color="auto" w:fill="FFFF00"/>
         </w:rPr>
         <w:t>damage to the sector.</w:t>
       </w:r>
@@ -635,6 +639,7 @@
           <w:sz w:val="24"/>
           <w:highlight w:val="yellow"/>
           <w:u w:val="single"/>
+          <w:shd w:val="clear" w:color="auto" w:fill="FFFF00"/>
         </w:rPr>
         <w:t>However, two years later, Amsterdam has gained a whole new role in the global data center</w:t>
       </w:r>
@@ -653,6 +658,7 @@
           <w:sz w:val="24"/>
           <w:highlight w:val="yellow"/>
           <w:u w:val="single"/>
+          <w:shd w:val="clear" w:color="auto" w:fill="FFFF00"/>
         </w:rPr>
         <w:t>realm, with expertise on</w:t>
       </w:r>
@@ -684,6 +690,7 @@
           <w:sz w:val="24"/>
           <w:highlight w:val="yellow"/>
           <w:u w:val="single"/>
+          <w:shd w:val="clear" w:color="auto" w:fill="FFFF00"/>
         </w:rPr>
         <w:t>sustainability</w:t>
       </w:r>
@@ -706,6 +713,7 @@
           <w:sz w:val="24"/>
           <w:highlight w:val="yellow"/>
           <w:u w:val="single"/>
+          <w:shd w:val="clear" w:color="auto" w:fill="FFFF00"/>
         </w:rPr>
         <w:t>With the new policies implemented, the data center hub has gained renewed attraction.</w:t>
       </w:r>
@@ -794,6 +802,7 @@
           <w:sz w:val="24"/>
           <w:highlight w:val="yellow"/>
           <w:u w:val="single"/>
+          <w:shd w:val="clear" w:color="auto" w:fill="FFFF00"/>
         </w:rPr>
         <w:t>the Netherlands’ still</w:t>
       </w:r>
@@ -812,6 +821,7 @@
           <w:sz w:val="24"/>
           <w:highlight w:val="yellow"/>
           <w:u w:val="single"/>
+          <w:shd w:val="clear" w:color="auto" w:fill="FFFF00"/>
         </w:rPr>
         <w:t>beholds a promising future</w:t>
       </w:r>
@@ -857,6 +867,7 @@
           <w:sz w:val="24"/>
           <w:highlight w:val="yellow"/>
           <w:u w:val="single"/>
+          <w:shd w:val="clear" w:color="auto" w:fill="FFFF00"/>
         </w:rPr>
         <w:t>don’t expect any Friday summer days’ surprises in the</w:t>
       </w:r>
@@ -875,6 +886,7 @@
           <w:sz w:val="24"/>
           <w:highlight w:val="yellow"/>
           <w:u w:val="single"/>
+          <w:shd w:val="clear" w:color="auto" w:fill="FFFF00"/>
         </w:rPr>
         <w:t>coming years.</w:t>
       </w:r>
@@ -953,6 +965,7 @@
           <w:sz w:val="24"/>
           <w:highlight w:val="yellow"/>
           <w:u w:val="single"/>
+          <w:shd w:val="clear" w:color="auto" w:fill="FFFF00"/>
         </w:rPr>
         <w:t>data centres</w:t>
       </w:r>
@@ -982,6 +995,7 @@
           <w:sz w:val="24"/>
           <w:highlight w:val="yellow"/>
           <w:u w:val="single"/>
+          <w:shd w:val="clear" w:color="auto" w:fill="FFFF00"/>
         </w:rPr>
         <w:t>were</w:t>
       </w:r>
@@ -1011,6 +1025,7 @@
           <w:sz w:val="24"/>
           <w:highlight w:val="yellow"/>
           <w:u w:val="single"/>
+          <w:shd w:val="clear" w:color="auto" w:fill="FFFF00"/>
         </w:rPr>
         <w:t>an “intensive” user of electricity and water</w:t>
       </w:r>
@@ -1028,6 +1043,7 @@
           <w:sz w:val="24"/>
           <w:highlight w:val="yellow"/>
           <w:u w:val="single"/>
+          <w:shd w:val="clear" w:color="auto" w:fill="FFFF00"/>
         </w:rPr>
         <w:t>a “temporary</w:t>
       </w:r>
@@ -1045,6 +1061,7 @@
           <w:sz w:val="24"/>
           <w:highlight w:val="yellow"/>
           <w:u w:val="single"/>
+          <w:shd w:val="clear" w:color="auto" w:fill="FFFF00"/>
         </w:rPr>
         <w:t>has</w:t>
       </w:r>
@@ -1062,6 +1079,7 @@
           <w:sz w:val="24"/>
           <w:highlight w:val="yellow"/>
           <w:u w:val="single"/>
+          <w:shd w:val="clear" w:color="auto" w:fill="FFFF00"/>
         </w:rPr>
         <w:t>been imposed</w:t>
       </w:r>
@@ -1079,6 +1097,7 @@
           <w:sz w:val="24"/>
           <w:highlight w:val="yellow"/>
           <w:u w:val="single"/>
+          <w:shd w:val="clear" w:color="auto" w:fill="FFFF00"/>
         </w:rPr>
         <w:t>as local authorities mull a balance</w:t>
       </w:r>
@@ -1097,6 +1116,7 @@
           <w:sz w:val="24"/>
           <w:highlight w:val="yellow"/>
           <w:u w:val="single"/>
+          <w:shd w:val="clear" w:color="auto" w:fill="FFFF00"/>
         </w:rPr>
         <w:t>between environment sustainability and supporting business needs.</w:t>
       </w:r>
@@ -1151,6 +1171,7 @@
           <w:sz w:val="24"/>
           <w:highlight w:val="yellow"/>
           <w:u w:val="single"/>
+          <w:shd w:val="clear" w:color="auto" w:fill="FFFF00"/>
         </w:rPr>
         <w:t>strive for quality, not quantity</w:t>
       </w:r>
@@ -1168,6 +1189,7 @@
           <w:sz w:val="24"/>
           <w:highlight w:val="yellow"/>
           <w:u w:val="single"/>
+          <w:shd w:val="clear" w:color="auto" w:fill="FFFF00"/>
         </w:rPr>
         <w:t>seek to anchor a range of data centres</w:t>
       </w:r>
@@ -1186,6 +1208,7 @@
           <w:sz w:val="24"/>
           <w:highlight w:val="yellow"/>
           <w:u w:val="single"/>
+          <w:shd w:val="clear" w:color="auto" w:fill="FFFF00"/>
         </w:rPr>
         <w:t>that can meet both industry and society’s needs, are best in class in terms of resource</w:t>
       </w:r>
@@ -1204,6 +1227,7 @@
           <w:sz w:val="24"/>
           <w:highlight w:val="yellow"/>
           <w:u w:val="single"/>
+          <w:shd w:val="clear" w:color="auto" w:fill="FFFF00"/>
         </w:rPr>
         <w:t>efficiency, and that continuously innovate to push the boundaries of resource efficiency</w:t>
       </w:r>
@@ -1257,6 +1281,7 @@
           <w:sz w:val="24"/>
           <w:highlight w:val="yellow"/>
           <w:u w:val="single"/>
+          <w:shd w:val="clear" w:color="auto" w:fill="FFFF00"/>
         </w:rPr>
         <w:t>The ban was lifted after a year</w:t>
       </w:r>
@@ -1289,6 +1314,7 @@
           <w:sz w:val="24"/>
           <w:highlight w:val="yellow"/>
           <w:u w:val="single"/>
+          <w:shd w:val="clear" w:color="auto" w:fill="FFFF00"/>
         </w:rPr>
         <w:t>locating data centres in specific zones with limits on power use</w:t>
       </w:r>
@@ -1330,6 +1356,7 @@
           <w:sz w:val="24"/>
           <w:highlight w:val="yellow"/>
           <w:u w:val="single"/>
+          <w:shd w:val="clear" w:color="auto" w:fill="FFFF00"/>
         </w:rPr>
         <w:t>important that Singapore ensures that the overall data centre ecosystem is</w:t>
       </w:r>
@@ -1348,6 +1375,7 @@
           <w:sz w:val="24"/>
           <w:highlight w:val="yellow"/>
           <w:u w:val="single"/>
+          <w:shd w:val="clear" w:color="auto" w:fill="FFFF00"/>
         </w:rPr>
         <w:t>environmentally sustainable, while balancing the need for growth.”</w:t>
       </w:r>
@@ -1378,6 +1406,7 @@
           <w:sz w:val="24"/>
           <w:highlight w:val="yellow"/>
           <w:u w:val="single"/>
+          <w:shd w:val="clear" w:color="auto" w:fill="FFFF00"/>
         </w:rPr>
         <w:t>offers Singapore “a timely opportunity” to invest in green technologies,</w:t>
       </w:r>
@@ -1396,6 +1425,7 @@
           <w:sz w:val="24"/>
           <w:highlight w:val="yellow"/>
           <w:u w:val="single"/>
+          <w:shd w:val="clear" w:color="auto" w:fill="FFFF00"/>
         </w:rPr>
         <w:t>higher-performance infrastructure and develop technology talent</w:t>
       </w:r>
@@ -1425,6 +1455,7 @@
           <w:sz w:val="24"/>
           <w:highlight w:val="yellow"/>
           <w:u w:val="single"/>
+          <w:shd w:val="clear" w:color="auto" w:fill="FFFF00"/>
         </w:rPr>
         <w:t>help the country keep up with future expansion in data centre demand</w:t>
       </w:r>
@@ -1507,6 +1538,7 @@
           <w:sz w:val="24"/>
           <w:highlight w:val="yellow"/>
           <w:u w:val="single"/>
+          <w:shd w:val="clear" w:color="auto" w:fill="FFFF00"/>
         </w:rPr>
         <w:t>Singapore has been a popular site to build data centres</w:t>
       </w:r>
@@ -1524,6 +1556,7 @@
           <w:sz w:val="24"/>
           <w:highlight w:val="yellow"/>
           <w:u w:val="single"/>
+          <w:shd w:val="clear" w:color="auto" w:fill="FFFF00"/>
         </w:rPr>
         <w:t>So far, it remains the case even with the ongoing</w:t>
       </w:r>
@@ -1542,6 +1575,7 @@
           <w:sz w:val="24"/>
           <w:highlight w:val="yellow"/>
           <w:u w:val="single"/>
+          <w:shd w:val="clear" w:color="auto" w:fill="FFFF00"/>
         </w:rPr>
         <w:t>moratorium, industry observers said.</w:t>
       </w:r>
@@ -1572,6 +1606,7 @@
           <w:sz w:val="24"/>
           <w:highlight w:val="yellow"/>
           <w:u w:val="single"/>
+          <w:shd w:val="clear" w:color="auto" w:fill="FFFF00"/>
         </w:rPr>
         <w:t>Singapore came in second in a recent list of top data centre markets</w:t>
       </w:r>
@@ -1589,6 +1624,7 @@
           <w:sz w:val="24"/>
           <w:highlight w:val="yellow"/>
           <w:u w:val="single"/>
+          <w:shd w:val="clear" w:color="auto" w:fill="FFFF00"/>
         </w:rPr>
         <w:t>just behind the United States</w:t>
       </w:r>
@@ -1618,6 +1654,7 @@
           <w:sz w:val="24"/>
           <w:highlight w:val="yellow"/>
           <w:u w:val="single"/>
+          <w:shd w:val="clear" w:color="auto" w:fill="FFFF00"/>
         </w:rPr>
         <w:t>Rather than the moratorium being considered off-putting for potential data center providers,</w:t>
       </w:r>
@@ -1636,6 +1673,7 @@
           <w:sz w:val="24"/>
           <w:highlight w:val="yellow"/>
           <w:u w:val="single"/>
+          <w:shd w:val="clear" w:color="auto" w:fill="FFFF00"/>
         </w:rPr>
         <w:t>it has forced them to rethink their current strategies and look for alternative models, as they</w:t>
       </w:r>
@@ -1654,6 +1692,7 @@
           <w:sz w:val="24"/>
           <w:highlight w:val="yellow"/>
           <w:u w:val="single"/>
+          <w:shd w:val="clear" w:color="auto" w:fill="FFFF00"/>
         </w:rPr>
         <w:t>have already started to do globally anyway,”</w:t>
       </w:r>
@@ -1695,6 +1734,7 @@
           <w:sz w:val="24"/>
           <w:highlight w:val="yellow"/>
           <w:u w:val="single"/>
+          <w:shd w:val="clear" w:color="auto" w:fill="FFFF00"/>
         </w:rPr>
         <w:t>it's unlikely that the moratorium will deter providers from investing in Singapore in</w:t>
       </w:r>
@@ -1713,6 +1753,7 @@
           <w:sz w:val="24"/>
           <w:highlight w:val="yellow"/>
           <w:u w:val="single"/>
+          <w:shd w:val="clear" w:color="auto" w:fill="FFFF00"/>
         </w:rPr>
         <w:t>the mid to long term</w:t>
       </w:r>
@@ -1851,6 +1892,7 @@
           <w:sz w:val="24"/>
           <w:highlight w:val="yellow"/>
           <w:u w:val="single"/>
+          <w:shd w:val="clear" w:color="auto" w:fill="FFFF00"/>
         </w:rPr>
         <w:t>although the US</w:t>
       </w:r>
@@ -1875,6 +1917,7 @@
           <w:sz w:val="24"/>
           <w:highlight w:val="yellow"/>
           <w:u w:val="single"/>
+          <w:shd w:val="clear" w:color="auto" w:fill="FFFF00"/>
         </w:rPr>
         <w:t>leads</w:t>
       </w:r>
@@ -1892,6 +1935,7 @@
           <w:sz w:val="24"/>
           <w:highlight w:val="yellow"/>
           <w:u w:val="single"/>
+          <w:shd w:val="clear" w:color="auto" w:fill="FFFF00"/>
         </w:rPr>
         <w:t>in</w:t>
       </w:r>
@@ -1916,6 +1960,7 @@
           <w:sz w:val="24"/>
           <w:highlight w:val="yellow"/>
           <w:u w:val="single"/>
+          <w:shd w:val="clear" w:color="auto" w:fill="FFFF00"/>
         </w:rPr>
         <w:t>core technologies underpinning AI, that</w:t>
       </w:r>
@@ -1948,6 +1993,7 @@
           <w:sz w:val="24"/>
           <w:highlight w:val="yellow"/>
           <w:u w:val="single"/>
+          <w:shd w:val="clear" w:color="auto" w:fill="FFFF00"/>
         </w:rPr>
         <w:t>will</w:t>
       </w:r>
@@ -1965,6 +2011,7 @@
           <w:sz w:val="24"/>
           <w:highlight w:val="yellow"/>
           <w:u w:val="single"/>
+          <w:shd w:val="clear" w:color="auto" w:fill="FFFF00"/>
         </w:rPr>
         <w:t>prove difficult to sustain if</w:t>
       </w:r>
@@ -1989,6 +2036,7 @@
           <w:sz w:val="24"/>
           <w:highlight w:val="yellow"/>
           <w:u w:val="single"/>
+          <w:shd w:val="clear" w:color="auto" w:fill="FFFF00"/>
         </w:rPr>
         <w:t>infrastructure</w:t>
       </w:r>
@@ -2014,6 +2062,7 @@
           <w:sz w:val="24"/>
           <w:highlight w:val="yellow"/>
           <w:u w:val="single"/>
+          <w:shd w:val="clear" w:color="auto" w:fill="FFFF00"/>
         </w:rPr>
         <w:t>cannot keep pace</w:t>
       </w:r>
@@ -2214,6 +2263,7 @@
           <w:sz w:val="24"/>
           <w:highlight w:val="yellow"/>
           <w:u w:val="single"/>
+          <w:shd w:val="clear" w:color="auto" w:fill="FFFF00"/>
         </w:rPr>
         <w:t>China</w:t>
       </w:r>
@@ -2231,6 +2281,7 @@
           <w:sz w:val="24"/>
           <w:highlight w:val="yellow"/>
           <w:u w:val="single"/>
+          <w:shd w:val="clear" w:color="auto" w:fill="FFFF00"/>
         </w:rPr>
         <w:t>is</w:t>
       </w:r>
@@ -2256,6 +2307,7 @@
           <w:sz w:val="24"/>
           <w:highlight w:val="yellow"/>
           <w:u w:val="single"/>
+          <w:shd w:val="clear" w:color="auto" w:fill="FFFF00"/>
         </w:rPr>
         <w:t>building momentum in real-world</w:t>
       </w:r>
@@ -2274,6 +2326,7 @@
           <w:sz w:val="24"/>
           <w:highlight w:val="yellow"/>
           <w:u w:val="single"/>
+          <w:shd w:val="clear" w:color="auto" w:fill="FFFF00"/>
         </w:rPr>
         <w:t>adoption.</w:t>
       </w:r>
@@ -2296,6 +2349,7 @@
           <w:sz w:val="24"/>
           <w:highlight w:val="yellow"/>
           <w:u w:val="single"/>
+          <w:shd w:val="clear" w:color="auto" w:fill="FFFF00"/>
         </w:rPr>
         <w:t>CHINA’S PLANNED GENERATION BUILD-OUT DWARFS THE US</w:t>
       </w:r>
@@ -2319,6 +2373,7 @@
           <w:sz w:val="24"/>
           <w:highlight w:val="yellow"/>
           <w:u w:val="single"/>
+          <w:shd w:val="clear" w:color="auto" w:fill="FFFF00"/>
         </w:rPr>
         <w:t>This</w:t>
       </w:r>
@@ -2358,6 +2413,7 @@
           <w:sz w:val="24"/>
           <w:highlight w:val="yellow"/>
           <w:u w:val="single"/>
+          <w:shd w:val="clear" w:color="auto" w:fill="FFFF00"/>
         </w:rPr>
         <w:t>US-China gap becomes most tangible</w:t>
       </w:r>
@@ -2375,6 +2431,7 @@
           <w:sz w:val="24"/>
           <w:highlight w:val="yellow"/>
           <w:u w:val="single"/>
+          <w:shd w:val="clear" w:color="auto" w:fill="FFFF00"/>
         </w:rPr>
         <w:t>China appears structurally less constrained in its</w:t>
       </w:r>
@@ -2393,6 +2450,7 @@
           <w:sz w:val="24"/>
           <w:highlight w:val="yellow"/>
           <w:u w:val="single"/>
+          <w:shd w:val="clear" w:color="auto" w:fill="FFFF00"/>
         </w:rPr>
         <w:t>ability to supply the required power infrastructure, aided by a more centralised system and a</w:t>
       </w:r>
@@ -2411,6 +2469,7 @@
           <w:sz w:val="24"/>
           <w:highlight w:val="yellow"/>
           <w:u w:val="single"/>
+          <w:shd w:val="clear" w:color="auto" w:fill="FFFF00"/>
         </w:rPr>
         <w:t>greater willingness to build ahead of demand</w:t>
       </w:r>
@@ -2428,6 +2487,7 @@
           <w:sz w:val="24"/>
           <w:highlight w:val="yellow"/>
           <w:u w:val="single"/>
+          <w:shd w:val="clear" w:color="auto" w:fill="FFFF00"/>
         </w:rPr>
         <w:t>In</w:t>
       </w:r>
@@ -2445,6 +2505,7 @@
           <w:sz w:val="24"/>
           <w:highlight w:val="yellow"/>
           <w:u w:val="single"/>
+          <w:shd w:val="clear" w:color="auto" w:fill="FFFF00"/>
         </w:rPr>
         <w:t>the US</w:t>
       </w:r>
@@ -2462,6 +2523,7 @@
           <w:sz w:val="24"/>
           <w:highlight w:val="yellow"/>
           <w:u w:val="single"/>
+          <w:shd w:val="clear" w:color="auto" w:fill="FFFF00"/>
         </w:rPr>
         <w:t>growth</w:t>
       </w:r>
@@ -2479,6 +2541,7 @@
           <w:sz w:val="24"/>
           <w:highlight w:val="yellow"/>
           <w:u w:val="single"/>
+          <w:shd w:val="clear" w:color="auto" w:fill="FFFF00"/>
         </w:rPr>
         <w:t>is</w:t>
       </w:r>
@@ -2510,6 +2573,7 @@
           <w:sz w:val="24"/>
           <w:highlight w:val="yellow"/>
           <w:u w:val="single"/>
+          <w:shd w:val="clear" w:color="auto" w:fill="FFFF00"/>
         </w:rPr>
         <w:t>slowed by</w:t>
       </w:r>
@@ -2528,6 +2592,7 @@
           <w:sz w:val="24"/>
           <w:highlight w:val="yellow"/>
           <w:u w:val="single"/>
+          <w:shd w:val="clear" w:color="auto" w:fill="FFFF00"/>
         </w:rPr>
         <w:t>fragmented regulation</w:t>
       </w:r>
@@ -2545,6 +2610,7 @@
           <w:sz w:val="24"/>
           <w:highlight w:val="yellow"/>
           <w:u w:val="single"/>
+          <w:shd w:val="clear" w:color="auto" w:fill="FFFF00"/>
         </w:rPr>
         <w:t>Chinese power generation additions are expected to be 4x that of the US by 2030,</w:t>
       </w:r>
@@ -2599,6 +2665,7 @@
           <w:sz w:val="24"/>
           <w:highlight w:val="yellow"/>
           <w:u w:val="single"/>
+          <w:shd w:val="clear" w:color="auto" w:fill="FFFF00"/>
         </w:rPr>
         <w:t>resolving roadblocks</w:t>
       </w:r>
@@ -2661,6 +2728,7 @@
           <w:sz w:val="24"/>
           <w:highlight w:val="yellow"/>
           <w:u w:val="single"/>
+          <w:shd w:val="clear" w:color="auto" w:fill="FFFF00"/>
         </w:rPr>
         <w:t>is part of the wider effort to ensure the US remains competitive</w:t>
       </w:r>
@@ -2743,6 +2811,7 @@
           <w:sz w:val="24"/>
           <w:highlight w:val="yellow"/>
           <w:u w:val="single"/>
+          <w:shd w:val="clear" w:color="auto" w:fill="FFFF00"/>
         </w:rPr>
         <w:t>Last year, states introduced more than 1,200 AI-related bills</w:t>
       </w:r>
@@ -2760,6 +2829,7 @@
           <w:sz w:val="24"/>
           <w:highlight w:val="yellow"/>
           <w:u w:val="single"/>
+          <w:shd w:val="clear" w:color="auto" w:fill="FFFF00"/>
         </w:rPr>
         <w:t>creating</w:t>
       </w:r>
@@ -2778,6 +2848,7 @@
           <w:sz w:val="24"/>
           <w:highlight w:val="yellow"/>
           <w:u w:val="single"/>
+          <w:shd w:val="clear" w:color="auto" w:fill="FFFF00"/>
         </w:rPr>
         <w:t>contradictory requirements that multiply compliance burdens</w:t>
       </w:r>
@@ -2802,6 +2873,7 @@
           <w:sz w:val="24"/>
           <w:highlight w:val="yellow"/>
           <w:u w:val="single"/>
+          <w:shd w:val="clear" w:color="auto" w:fill="FFFF00"/>
         </w:rPr>
         <w:t>Each jurisdiction defines</w:t>
       </w:r>
@@ -2820,6 +2892,7 @@
           <w:sz w:val="24"/>
           <w:highlight w:val="yellow"/>
           <w:u w:val="single"/>
+          <w:shd w:val="clear" w:color="auto" w:fill="FFFF00"/>
         </w:rPr>
         <w:t>“artificial intelligence,” “high-risk systems,” and “consequential decisions” differently, forcing</w:t>
       </w:r>
@@ -2838,6 +2911,7 @@
           <w:sz w:val="24"/>
           <w:highlight w:val="yellow"/>
           <w:u w:val="single"/>
+          <w:shd w:val="clear" w:color="auto" w:fill="FFFF00"/>
         </w:rPr>
         <w:t xml:space="preserve">companies to analyze identical technology under multiple incompatible frameworks. A </w:t>
       </w:r>
@@ -2862,6 +2936,7 @@
           <w:sz w:val="24"/>
           <w:highlight w:val="yellow"/>
           <w:u w:val="single"/>
+          <w:shd w:val="clear" w:color="auto" w:fill="FFFF00"/>
         </w:rPr>
         <w:t>tool that satisfies California’s</w:t>
       </w:r>
@@ -2887,6 +2962,7 @@
           <w:sz w:val="24"/>
           <w:highlight w:val="yellow"/>
           <w:u w:val="single"/>
+          <w:shd w:val="clear" w:color="auto" w:fill="FFFF00"/>
         </w:rPr>
         <w:t>recordkeeping and anti-bias testing requirements must</w:t>
       </w:r>
@@ -2905,6 +2981,7 @@
           <w:sz w:val="24"/>
           <w:highlight w:val="yellow"/>
           <w:u w:val="single"/>
+          <w:shd w:val="clear" w:color="auto" w:fill="FFFF00"/>
         </w:rPr>
         <w:t>also meet Colorado’s separate impact assessment mandates and New York City’s independent</w:t>
       </w:r>
@@ -2923,6 +3000,7 @@
           <w:sz w:val="24"/>
           <w:highlight w:val="yellow"/>
           <w:u w:val="single"/>
+          <w:shd w:val="clear" w:color="auto" w:fill="FFFF00"/>
         </w:rPr>
         <w:t>bias audit regime with distinct notice requirements</w:t>
       </w:r>
@@ -2977,6 +3055,7 @@
           <w:sz w:val="24"/>
           <w:highlight w:val="yellow"/>
           <w:u w:val="single"/>
+          <w:shd w:val="clear" w:color="auto" w:fill="FFFF00"/>
         </w:rPr>
         <w:t>compliance costs add approximately 17 percent overhead to AI system</w:t>
       </w:r>
@@ -2995,6 +3074,7 @@
           <w:sz w:val="24"/>
           <w:highlight w:val="yellow"/>
           <w:u w:val="single"/>
+          <w:shd w:val="clear" w:color="auto" w:fill="FFFF00"/>
         </w:rPr>
         <w:t>expenses.</w:t>
       </w:r>
@@ -3099,6 +3179,7 @@
           <w:sz w:val="24"/>
           <w:highlight w:val="yellow"/>
           <w:u w:val="single"/>
+          <w:shd w:val="clear" w:color="auto" w:fill="FFFF00"/>
         </w:rPr>
         <w:t>regulatory costs consume</w:t>
       </w:r>
@@ -3117,6 +3198,7 @@
           <w:sz w:val="24"/>
           <w:highlight w:val="yellow"/>
           <w:u w:val="single"/>
+          <w:shd w:val="clear" w:color="auto" w:fill="FFFF00"/>
         </w:rPr>
         <w:t>resources faster than startups can generate revenue</w:t>
       </w:r>
@@ -3193,6 +3275,7 @@
           <w:sz w:val="24"/>
           <w:highlight w:val="yellow"/>
           <w:u w:val="single"/>
+          <w:shd w:val="clear" w:color="auto" w:fill="FFFF00"/>
         </w:rPr>
         <w:t>it’s the difference between survival and bankruptcy</w:t>
       </w:r>
@@ -3225,6 +3308,7 @@
           <w:sz w:val="24"/>
           <w:highlight w:val="yellow"/>
           <w:u w:val="single"/>
+          <w:shd w:val="clear" w:color="auto" w:fill="FFFF00"/>
         </w:rPr>
         <w:t>While American entrepreneurs waste engineering talent on</w:t>
       </w:r>
@@ -3243,6 +3327,7 @@
           <w:sz w:val="24"/>
           <w:highlight w:val="yellow"/>
           <w:u w:val="single"/>
+          <w:shd w:val="clear" w:color="auto" w:fill="FFFF00"/>
         </w:rPr>
         <w:t>contradictory compliance regimes, Chinese AI companies operate under a unified national</w:t>
       </w:r>
@@ -3261,6 +3346,7 @@
           <w:sz w:val="24"/>
           <w:highlight w:val="yellow"/>
           <w:u w:val="single"/>
+          <w:shd w:val="clear" w:color="auto" w:fill="FFFF00"/>
         </w:rPr>
         <w:t>framework.</w:t>
       </w:r>
@@ -3294,6 +3380,7 @@
           <w:sz w:val="24"/>
           <w:highlight w:val="yellow"/>
           <w:u w:val="single"/>
+          <w:shd w:val="clear" w:color="auto" w:fill="FFFF00"/>
         </w:rPr>
         <w:t>When compliance costs exceed</w:t>
       </w:r>
@@ -3312,6 +3399,7 @@
           <w:sz w:val="24"/>
           <w:highlight w:val="yellow"/>
           <w:u w:val="single"/>
+          <w:shd w:val="clear" w:color="auto" w:fill="FFFF00"/>
         </w:rPr>
         <w:t>development budgets, innovation doesn’t slow—it stops altogether or moves to foreign</w:t>
       </w:r>
@@ -3330,6 +3418,7 @@
           <w:sz w:val="24"/>
           <w:highlight w:val="yellow"/>
           <w:u w:val="single"/>
+          <w:shd w:val="clear" w:color="auto" w:fill="FFFF00"/>
         </w:rPr>
         <w:t>jurisdictions where the rules are clear.</w:t>
       </w:r>
@@ -3378,6 +3467,7 @@
           <w:sz w:val="24"/>
           <w:highlight w:val="yellow"/>
           <w:u w:val="single"/>
+          <w:shd w:val="clear" w:color="auto" w:fill="FFFF00"/>
         </w:rPr>
         <w:t>Congress must act.</w:t>
       </w:r>
@@ -3418,6 +3508,7 @@
           <w:sz w:val="24"/>
           <w:highlight w:val="yellow"/>
           <w:u w:val="single"/>
+          <w:shd w:val="clear" w:color="auto" w:fill="FFFF00"/>
         </w:rPr>
         <w:t>Every month that passes with this regulatory chaos intact</w:t>
       </w:r>
@@ -3436,6 +3527,7 @@
           <w:sz w:val="24"/>
           <w:highlight w:val="yellow"/>
           <w:u w:val="single"/>
+          <w:shd w:val="clear" w:color="auto" w:fill="FFFF00"/>
         </w:rPr>
         <w:t>represents another month of American innovation surrendered to better-organized</w:t>
       </w:r>
@@ -3454,6 +3546,7 @@
           <w:sz w:val="24"/>
           <w:highlight w:val="yellow"/>
           <w:u w:val="single"/>
+          <w:shd w:val="clear" w:color="auto" w:fill="FFFF00"/>
         </w:rPr>
         <w:t>competitors</w:t>
       </w:r>
@@ -3561,6 +3654,7 @@
           <w:sz w:val="24"/>
           <w:highlight w:val="yellow"/>
           <w:u w:val="single"/>
+          <w:shd w:val="clear" w:color="auto" w:fill="FFFF00"/>
         </w:rPr>
         <w:t>the AI Data</w:t>
       </w:r>
@@ -3579,6 +3673,7 @@
           <w:sz w:val="24"/>
           <w:highlight w:val="yellow"/>
           <w:u w:val="single"/>
+          <w:shd w:val="clear" w:color="auto" w:fill="FFFF00"/>
         </w:rPr>
         <w:t>Center Moratorium Act</w:t>
       </w:r>
@@ -3596,6 +3691,7 @@
           <w:sz w:val="24"/>
           <w:highlight w:val="yellow"/>
           <w:u w:val="single"/>
+          <w:shd w:val="clear" w:color="auto" w:fill="FFFF00"/>
         </w:rPr>
         <w:t>would impose a nationwide pause on the construction and</w:t>
       </w:r>
@@ -3614,6 +3710,7 @@
           <w:sz w:val="24"/>
           <w:highlight w:val="yellow"/>
           <w:u w:val="single"/>
+          <w:shd w:val="clear" w:color="auto" w:fill="FFFF00"/>
         </w:rPr>
         <w:t>expansion of AI data centers until Congress enacts comprehensive federal safeguards.</w:t>
       </w:r>
@@ -3701,6 +3798,7 @@
           <w:sz w:val="24"/>
           <w:highlight w:val="yellow"/>
           <w:u w:val="single"/>
+          <w:shd w:val="clear" w:color="auto" w:fill="FFFF00"/>
         </w:rPr>
         <w:t>The cumulative effect of these statutes is a patchwork in which legal ambiguity, duplication,</w:t>
       </w:r>
@@ -3719,6 +3817,7 @@
           <w:sz w:val="24"/>
           <w:highlight w:val="yellow"/>
           <w:u w:val="single"/>
+          <w:shd w:val="clear" w:color="auto" w:fill="FFFF00"/>
         </w:rPr>
         <w:t>and enforcement complexity are the norm</w:t>
       </w:r>
@@ -3743,6 +3842,7 @@
           <w:sz w:val="24"/>
           <w:highlight w:val="yellow"/>
           <w:u w:val="single"/>
+          <w:shd w:val="clear" w:color="auto" w:fill="FFFF00"/>
         </w:rPr>
         <w:t>costs multiply, firms lose flexibility, and</w:t>
       </w:r>
@@ -3761,6 +3861,7 @@
           <w:sz w:val="24"/>
           <w:highlight w:val="yellow"/>
           <w:u w:val="single"/>
+          <w:shd w:val="clear" w:color="auto" w:fill="FFFF00"/>
         </w:rPr>
         <w:t>focus shifts from innovation to compliance</w:t>
       </w:r>
@@ -3799,6 +3900,7 @@
           <w:sz w:val="24"/>
           <w:highlight w:val="yellow"/>
           <w:u w:val="single"/>
+          <w:shd w:val="clear" w:color="auto" w:fill="FFFF00"/>
         </w:rPr>
         <w:t>textbook examples of regulatory</w:t>
       </w:r>
@@ -3817,6 +3919,7 @@
           <w:sz w:val="24"/>
           <w:highlight w:val="yellow"/>
           <w:u w:val="single"/>
+          <w:shd w:val="clear" w:color="auto" w:fill="FFFF00"/>
         </w:rPr>
         <w:t>deadweight loss and compliance arbitrage across jurisdictions.</w:t>
       </w:r>
@@ -3840,6 +3943,7 @@
           <w:sz w:val="24"/>
           <w:highlight w:val="yellow"/>
           <w:u w:val="single"/>
+          <w:shd w:val="clear" w:color="auto" w:fill="FFFF00"/>
         </w:rPr>
         <w:t>A</w:t>
       </w:r>
@@ -3871,6 +3975,7 @@
           <w:sz w:val="24"/>
           <w:highlight w:val="yellow"/>
           <w:u w:val="single"/>
+          <w:shd w:val="clear" w:color="auto" w:fill="FFFF00"/>
         </w:rPr>
         <w:t>moratorium</w:t>
       </w:r>
@@ -3888,6 +3993,7 @@
           <w:sz w:val="24"/>
           <w:highlight w:val="yellow"/>
           <w:u w:val="single"/>
+          <w:shd w:val="clear" w:color="auto" w:fill="FFFF00"/>
         </w:rPr>
         <w:t>would</w:t>
       </w:r>
@@ -3919,6 +4025,7 @@
           <w:sz w:val="24"/>
           <w:highlight w:val="yellow"/>
           <w:u w:val="single"/>
+          <w:shd w:val="clear" w:color="auto" w:fill="FFFF00"/>
         </w:rPr>
         <w:t>freeze this dynamic, preserv</w:t>
       </w:r>
@@ -3936,6 +4043,7 @@
           <w:sz w:val="24"/>
           <w:highlight w:val="yellow"/>
           <w:u w:val="single"/>
+          <w:shd w:val="clear" w:color="auto" w:fill="FFFF00"/>
         </w:rPr>
         <w:t>policymakers’</w:t>
       </w:r>
@@ -3954,6 +4062,7 @@
           <w:sz w:val="24"/>
           <w:highlight w:val="yellow"/>
           <w:u w:val="single"/>
+          <w:shd w:val="clear" w:color="auto" w:fill="FFFF00"/>
         </w:rPr>
         <w:t>ability to take stock</w:t>
       </w:r>
@@ -3978,6 +4087,7 @@
           <w:sz w:val="24"/>
           <w:highlight w:val="yellow"/>
           <w:u w:val="single"/>
+          <w:shd w:val="clear" w:color="auto" w:fill="FFFF00"/>
         </w:rPr>
         <w:t>and design a unified national framework</w:t>
       </w:r>
@@ -3995,6 +4105,7 @@
           <w:sz w:val="24"/>
           <w:highlight w:val="yellow"/>
           <w:u w:val="single"/>
+          <w:shd w:val="clear" w:color="auto" w:fill="FFFF00"/>
         </w:rPr>
         <w:t>that aligns</w:t>
       </w:r>
@@ -4013,6 +4124,7 @@
           <w:sz w:val="24"/>
           <w:highlight w:val="yellow"/>
           <w:u w:val="single"/>
+          <w:shd w:val="clear" w:color="auto" w:fill="FFFF00"/>
         </w:rPr>
         <w:t>with economic efficiency, supports research and entrepreneurship, and addresses algorithmic</w:t>
       </w:r>
@@ -4031,6 +4143,7 @@
           <w:sz w:val="24"/>
           <w:highlight w:val="yellow"/>
           <w:u w:val="single"/>
+          <w:shd w:val="clear" w:color="auto" w:fill="FFFF00"/>
         </w:rPr>
         <w:t>risks in proportion to their potential harms</w:t>
       </w:r>
@@ -4133,6 +4246,7 @@
           <w:sz w:val="24"/>
           <w:highlight w:val="yellow"/>
           <w:u w:val="single"/>
+          <w:shd w:val="clear" w:color="auto" w:fill="FFFF00"/>
         </w:rPr>
         <w:t>patchwork</w:t>
       </w:r>
@@ -4165,6 +4279,7 @@
           <w:sz w:val="24"/>
           <w:highlight w:val="yellow"/>
           <w:u w:val="single"/>
+          <w:shd w:val="clear" w:color="auto" w:fill="FFFF00"/>
         </w:rPr>
         <w:t>laws</w:t>
       </w:r>
@@ -4204,6 +4319,7 @@
           <w:sz w:val="24"/>
           <w:highlight w:val="yellow"/>
           <w:u w:val="single"/>
+          <w:shd w:val="clear" w:color="auto" w:fill="FFFF00"/>
         </w:rPr>
         <w:t>could exceed $1 trillion</w:t>
       </w:r>
@@ -4228,6 +4344,7 @@
           <w:sz w:val="24"/>
           <w:highlight w:val="yellow"/>
           <w:u w:val="single"/>
+          <w:shd w:val="clear" w:color="auto" w:fill="FFFF00"/>
         </w:rPr>
         <w:t>with</w:t>
       </w:r>
@@ -4252,6 +4369,7 @@
           <w:sz w:val="24"/>
           <w:highlight w:val="yellow"/>
           <w:u w:val="single"/>
+          <w:shd w:val="clear" w:color="auto" w:fill="FFFF00"/>
         </w:rPr>
         <w:t>$200 billion hitting</w:t>
       </w:r>
@@ -4270,6 +4388,7 @@
           <w:sz w:val="24"/>
           <w:highlight w:val="yellow"/>
           <w:u w:val="single"/>
+          <w:shd w:val="clear" w:color="auto" w:fill="FFFF00"/>
         </w:rPr>
         <w:t>small businesses.</w:t>
       </w:r>
@@ -4484,6 +4603,7 @@
           <w:sz w:val="24"/>
           <w:highlight w:val="yellow"/>
           <w:u w:val="single"/>
+          <w:shd w:val="clear" w:color="auto" w:fill="FFFF00"/>
         </w:rPr>
         <w:t>developers</w:t>
       </w:r>
@@ -4502,6 +4622,7 @@
           <w:sz w:val="24"/>
           <w:highlight w:val="yellow"/>
           <w:u w:val="single"/>
+          <w:shd w:val="clear" w:color="auto" w:fill="FFFF00"/>
         </w:rPr>
         <w:t>announced</w:t>
       </w:r>
@@ -4520,6 +4641,7 @@
           <w:sz w:val="24"/>
           <w:highlight w:val="yellow"/>
           <w:u w:val="single"/>
+          <w:shd w:val="clear" w:color="auto" w:fill="FFFF00"/>
         </w:rPr>
         <w:t>new hyperscale</w:t>
       </w:r>
@@ -4539,6 +4661,7 @@
           <w:sz w:val="24"/>
           <w:highlight w:val="yellow"/>
           <w:u w:val="single"/>
+          <w:shd w:val="clear" w:color="auto" w:fill="FFFF00"/>
         </w:rPr>
         <w:t>center</w:t>
       </w:r>
@@ -4566,6 +4689,7 @@
           <w:sz w:val="24"/>
           <w:highlight w:val="yellow"/>
           <w:u w:val="single"/>
+          <w:shd w:val="clear" w:color="auto" w:fill="FFFF00"/>
         </w:rPr>
         <w:t>s</w:t>
       </w:r>
@@ -4933,6 +5057,7 @@
           <w:sz w:val="24"/>
           <w:highlight w:val="yellow"/>
           <w:u w:val="single"/>
+          <w:shd w:val="clear" w:color="auto" w:fill="FFFF00"/>
         </w:rPr>
         <w:t>AI’s exponential growth</w:t>
       </w:r>
@@ -4951,6 +5076,7 @@
           <w:sz w:val="24"/>
           <w:highlight w:val="yellow"/>
           <w:u w:val="single"/>
+          <w:shd w:val="clear" w:color="auto" w:fill="FFFF00"/>
         </w:rPr>
         <w:t>push</w:t>
       </w:r>
@@ -4969,6 +5095,7 @@
           <w:sz w:val="24"/>
           <w:highlight w:val="yellow"/>
           <w:u w:val="single"/>
+          <w:shd w:val="clear" w:color="auto" w:fill="FFFF00"/>
         </w:rPr>
         <w:t>power</w:t>
       </w:r>
@@ -5026,6 +5153,7 @@
           <w:sz w:val="24"/>
           <w:highlight w:val="yellow"/>
           <w:u w:val="single"/>
+          <w:shd w:val="clear" w:color="auto" w:fill="FFFF00"/>
         </w:rPr>
         <w:t>Risks to a</w:t>
       </w:r>
@@ -5044,6 +5172,7 @@
           <w:sz w:val="24"/>
           <w:highlight w:val="yellow"/>
           <w:u w:val="single"/>
+          <w:shd w:val="clear" w:color="auto" w:fill="FFFF00"/>
         </w:rPr>
         <w:t>grid already</w:t>
       </w:r>
@@ -5062,6 +5191,7 @@
           <w:sz w:val="24"/>
           <w:highlight w:val="yellow"/>
           <w:u w:val="single"/>
+          <w:shd w:val="clear" w:color="auto" w:fill="FFFF00"/>
         </w:rPr>
         <w:t>under stress from</w:t>
       </w:r>
@@ -5080,6 +5210,7 @@
           <w:sz w:val="24"/>
           <w:highlight w:val="yellow"/>
           <w:u w:val="single"/>
+          <w:shd w:val="clear" w:color="auto" w:fill="FFFF00"/>
         </w:rPr>
         <w:t>weather</w:t>
       </w:r>
@@ -5426,6 +5557,7 @@
           <w:sz w:val="24"/>
           <w:highlight w:val="yellow"/>
           <w:u w:val="single"/>
+          <w:shd w:val="clear" w:color="auto" w:fill="FFFF00"/>
         </w:rPr>
         <w:t>a large cluster</w:t>
       </w:r>
@@ -5459,6 +5591,7 @@
           <w:sz w:val="24"/>
           <w:highlight w:val="yellow"/>
           <w:u w:val="single"/>
+          <w:shd w:val="clear" w:color="auto" w:fill="FFFF00"/>
         </w:rPr>
         <w:t>create</w:t>
       </w:r>
@@ -5494,6 +5627,7 @@
           <w:sz w:val="24"/>
           <w:highlight w:val="yellow"/>
           <w:u w:val="single"/>
+          <w:shd w:val="clear" w:color="auto" w:fill="FFFF00"/>
         </w:rPr>
         <w:t>cascading shutdowns</w:t>
       </w:r>
@@ -5591,6 +5725,7 @@
           <w:sz w:val="24"/>
           <w:highlight w:val="yellow"/>
           <w:u w:val="single"/>
+          <w:shd w:val="clear" w:color="auto" w:fill="FFFF00"/>
         </w:rPr>
         <w:t>speed of</w:t>
       </w:r>
@@ -5635,6 +5770,7 @@
           <w:sz w:val="24"/>
           <w:highlight w:val="yellow"/>
           <w:u w:val="single"/>
+          <w:shd w:val="clear" w:color="auto" w:fill="FFFF00"/>
         </w:rPr>
         <w:t>construction</w:t>
       </w:r>
@@ -5660,6 +5796,7 @@
           <w:sz w:val="24"/>
           <w:highlight w:val="yellow"/>
           <w:u w:val="single"/>
+          <w:shd w:val="clear" w:color="auto" w:fill="FFFF00"/>
         </w:rPr>
         <w:t>outpaces</w:t>
       </w:r>
@@ -5687,6 +5824,7 @@
           <w:sz w:val="24"/>
           <w:highlight w:val="yellow"/>
           <w:u w:val="single"/>
+          <w:shd w:val="clear" w:color="auto" w:fill="FFFF00"/>
         </w:rPr>
         <w:t>upgrades</w:t>
       </w:r>
@@ -5823,6 +5961,7 @@
           <w:sz w:val="24"/>
           <w:highlight w:val="yellow"/>
           <w:u w:val="single"/>
+          <w:shd w:val="clear" w:color="auto" w:fill="FFFF00"/>
         </w:rPr>
         <w:t>data center</w:t>
       </w:r>
@@ -5841,6 +5980,7 @@
           <w:sz w:val="24"/>
           <w:highlight w:val="yellow"/>
           <w:u w:val="single"/>
+          <w:shd w:val="clear" w:color="auto" w:fill="FFFF00"/>
         </w:rPr>
         <w:t>s</w:t>
       </w:r>
@@ -5859,6 +5999,7 @@
           <w:sz w:val="24"/>
           <w:highlight w:val="yellow"/>
           <w:u w:val="single"/>
+          <w:shd w:val="clear" w:color="auto" w:fill="FFFF00"/>
         </w:rPr>
         <w:t>do n</w:t>
       </w:r>
@@ -5878,6 +6019,7 @@
           <w:sz w:val="24"/>
           <w:highlight w:val="yellow"/>
           <w:u w:val="single"/>
+          <w:shd w:val="clear" w:color="auto" w:fill="FFFF00"/>
         </w:rPr>
         <w:t>t tell grid operators</w:t>
       </w:r>
@@ -5896,6 +6038,7 @@
           <w:sz w:val="24"/>
           <w:highlight w:val="yellow"/>
           <w:u w:val="single"/>
+          <w:shd w:val="clear" w:color="auto" w:fill="FFFF00"/>
         </w:rPr>
         <w:t>shifts are</w:t>
       </w:r>
@@ -5914,6 +6057,7 @@
           <w:sz w:val="24"/>
           <w:highlight w:val="yellow"/>
           <w:u w:val="single"/>
+          <w:shd w:val="clear" w:color="auto" w:fill="FFFF00"/>
         </w:rPr>
         <w:t>coming</w:t>
       </w:r>
@@ -5984,6 +6128,7 @@
           <w:sz w:val="24"/>
           <w:highlight w:val="yellow"/>
           <w:u w:val="single"/>
+          <w:shd w:val="clear" w:color="auto" w:fill="FFFF00"/>
         </w:rPr>
         <w:t>fluctuations</w:t>
       </w:r>
@@ -6002,6 +6147,7 @@
           <w:sz w:val="24"/>
           <w:highlight w:val="yellow"/>
           <w:u w:val="single"/>
+          <w:shd w:val="clear" w:color="auto" w:fill="FFFF00"/>
         </w:rPr>
         <w:t>activate</w:t>
       </w:r>
@@ -6029,6 +6175,7 @@
           <w:sz w:val="24"/>
           <w:highlight w:val="yellow"/>
           <w:u w:val="single"/>
+          <w:shd w:val="clear" w:color="auto" w:fill="FFFF00"/>
         </w:rPr>
         <w:t>automatic controls that close</w:t>
       </w:r>
@@ -6054,6 +6201,7 @@
           <w:sz w:val="24"/>
           <w:highlight w:val="yellow"/>
           <w:u w:val="single"/>
+          <w:shd w:val="clear" w:color="auto" w:fill="FFFF00"/>
         </w:rPr>
         <w:t>lines</w:t>
       </w:r>
@@ -6094,6 +6242,7 @@
           <w:sz w:val="24"/>
           <w:highlight w:val="yellow"/>
           <w:u w:val="single"/>
+          <w:shd w:val="clear" w:color="auto" w:fill="FFFF00"/>
         </w:rPr>
         <w:t>leading to uncontrolled</w:t>
       </w:r>
@@ -6130,6 +6279,7 @@
           <w:sz w:val="24"/>
           <w:highlight w:val="yellow"/>
           <w:u w:val="single"/>
+          <w:shd w:val="clear" w:color="auto" w:fill="FFFF00"/>
         </w:rPr>
         <w:t>outages</w:t>
       </w:r>
@@ -6271,6 +6421,7 @@
           <w:sz w:val="24"/>
           <w:highlight w:val="yellow"/>
           <w:u w:val="single"/>
+          <w:shd w:val="clear" w:color="auto" w:fill="FFFF00"/>
         </w:rPr>
         <w:t>that spread to</w:t>
       </w:r>
@@ -6289,6 +6440,7 @@
           <w:sz w:val="24"/>
           <w:highlight w:val="yellow"/>
           <w:u w:val="single"/>
+          <w:shd w:val="clear" w:color="auto" w:fill="FFFF00"/>
         </w:rPr>
         <w:t>plants</w:t>
       </w:r>
@@ -6405,6 +6557,7 @@
           <w:sz w:val="24"/>
           <w:highlight w:val="yellow"/>
           <w:u w:val="single"/>
+          <w:shd w:val="clear" w:color="auto" w:fill="FFFF00"/>
         </w:rPr>
         <w:t>50 scientists</w:t>
       </w:r>
@@ -6453,6 +6606,7 @@
           <w:sz w:val="24"/>
           <w:highlight w:val="yellow"/>
           <w:u w:val="single"/>
+          <w:shd w:val="clear" w:color="auto" w:fill="FFFF00"/>
         </w:rPr>
         <w:t>documents</w:t>
       </w:r>
@@ -6471,6 +6625,7 @@
           <w:sz w:val="24"/>
           <w:highlight w:val="yellow"/>
           <w:u w:val="single"/>
+          <w:shd w:val="clear" w:color="auto" w:fill="FFFF00"/>
         </w:rPr>
         <w:t>risk</w:t>
       </w:r>
@@ -6683,6 +6838,7 @@
           <w:sz w:val="24"/>
           <w:highlight w:val="yellow"/>
           <w:u w:val="single"/>
+          <w:shd w:val="clear" w:color="auto" w:fill="FFFF00"/>
         </w:rPr>
         <w:t>centers</w:t>
       </w:r>
@@ -6721,6 +6877,7 @@
           <w:sz w:val="24"/>
           <w:highlight w:val="yellow"/>
           <w:u w:val="single"/>
+          <w:shd w:val="clear" w:color="auto" w:fill="FFFF00"/>
         </w:rPr>
         <w:t>develop</w:t>
       </w:r>
@@ -6745,6 +6902,7 @@
           <w:sz w:val="24"/>
           <w:highlight w:val="yellow"/>
           <w:u w:val="single"/>
+          <w:shd w:val="clear" w:color="auto" w:fill="FFFF00"/>
         </w:rPr>
         <w:t>faster</w:t>
       </w:r>
@@ -6762,6 +6920,7 @@
           <w:sz w:val="24"/>
           <w:highlight w:val="yellow"/>
           <w:u w:val="single"/>
+          <w:shd w:val="clear" w:color="auto" w:fill="FFFF00"/>
         </w:rPr>
         <w:t>than</w:t>
       </w:r>
@@ -6786,6 +6945,7 @@
           <w:sz w:val="24"/>
           <w:highlight w:val="yellow"/>
           <w:u w:val="single"/>
+          <w:shd w:val="clear" w:color="auto" w:fill="FFFF00"/>
         </w:rPr>
         <w:t>infrastructure</w:t>
       </w:r>
@@ -6803,6 +6963,7 @@
           <w:sz w:val="24"/>
           <w:highlight w:val="yellow"/>
           <w:u w:val="single"/>
+          <w:shd w:val="clear" w:color="auto" w:fill="FFFF00"/>
         </w:rPr>
         <w:t>to</w:t>
       </w:r>
@@ -6820,6 +6981,7 @@
           <w:sz w:val="24"/>
           <w:highlight w:val="yellow"/>
           <w:u w:val="single"/>
+          <w:shd w:val="clear" w:color="auto" w:fill="FFFF00"/>
         </w:rPr>
         <w:t>support</w:t>
       </w:r>
@@ -6837,6 +6999,7 @@
           <w:sz w:val="24"/>
           <w:highlight w:val="yellow"/>
           <w:u w:val="single"/>
+          <w:shd w:val="clear" w:color="auto" w:fill="FFFF00"/>
         </w:rPr>
         <w:t>them</w:t>
       </w:r>
@@ -6869,6 +7032,7 @@
           <w:sz w:val="24"/>
           <w:highlight w:val="yellow"/>
           <w:u w:val="single"/>
+          <w:shd w:val="clear" w:color="auto" w:fill="FFFF00"/>
         </w:rPr>
         <w:t>threatens grid</w:t>
       </w:r>
@@ -6913,6 +7077,7 @@
           <w:sz w:val="24"/>
           <w:highlight w:val="yellow"/>
           <w:u w:val="single"/>
+          <w:shd w:val="clear" w:color="auto" w:fill="FFFF00"/>
         </w:rPr>
         <w:t>significant</w:t>
       </w:r>
@@ -6938,6 +7103,7 @@
           <w:sz w:val="24"/>
           <w:highlight w:val="yellow"/>
           <w:u w:val="single"/>
+          <w:shd w:val="clear" w:color="auto" w:fill="FFFF00"/>
         </w:rPr>
         <w:t>challenge</w:t>
       </w:r>
@@ -6962,6 +7128,7 @@
           <w:sz w:val="24"/>
           <w:highlight w:val="yellow"/>
           <w:u w:val="single"/>
+          <w:shd w:val="clear" w:color="auto" w:fill="FFFF00"/>
         </w:rPr>
         <w:t>is</w:t>
       </w:r>
@@ -6993,6 +7160,7 @@
           <w:sz w:val="24"/>
           <w:highlight w:val="yellow"/>
           <w:u w:val="single"/>
+          <w:shd w:val="clear" w:color="auto" w:fill="FFFF00"/>
         </w:rPr>
         <w:t>size and speed at which</w:t>
       </w:r>
@@ -7025,6 +7193,7 @@
           <w:sz w:val="24"/>
           <w:highlight w:val="yellow"/>
           <w:u w:val="single"/>
+          <w:shd w:val="clear" w:color="auto" w:fill="FFFF00"/>
         </w:rPr>
         <w:t>centers</w:t>
       </w:r>
@@ -7042,6 +7211,7 @@
           <w:sz w:val="24"/>
           <w:highlight w:val="yellow"/>
           <w:u w:val="single"/>
+          <w:shd w:val="clear" w:color="auto" w:fill="FFFF00"/>
         </w:rPr>
         <w:t>developed</w:t>
       </w:r>
@@ -7107,6 +7277,7 @@
           <w:sz w:val="24"/>
           <w:highlight w:val="yellow"/>
           <w:u w:val="single"/>
+          <w:shd w:val="clear" w:color="auto" w:fill="FFFF00"/>
         </w:rPr>
         <w:t>centers</w:t>
       </w:r>
@@ -7132,6 +7303,7 @@
           <w:sz w:val="24"/>
           <w:highlight w:val="yellow"/>
           <w:u w:val="single"/>
+          <w:shd w:val="clear" w:color="auto" w:fill="FFFF00"/>
         </w:rPr>
         <w:t>built</w:t>
       </w:r>
@@ -7156,6 +7328,7 @@
           <w:sz w:val="24"/>
           <w:highlight w:val="yellow"/>
           <w:u w:val="single"/>
+          <w:shd w:val="clear" w:color="auto" w:fill="FFFF00"/>
         </w:rPr>
         <w:t xml:space="preserve"> two years</w:t>
       </w:r>
@@ -7173,6 +7346,7 @@
           <w:sz w:val="24"/>
           <w:highlight w:val="yellow"/>
           <w:u w:val="single"/>
+          <w:shd w:val="clear" w:color="auto" w:fill="FFFF00"/>
         </w:rPr>
         <w:t>faster than</w:t>
       </w:r>
@@ -7204,6 +7378,7 @@
           <w:sz w:val="24"/>
           <w:highlight w:val="yellow"/>
           <w:u w:val="single"/>
+          <w:shd w:val="clear" w:color="auto" w:fill="FFFF00"/>
         </w:rPr>
         <w:t>industrial</w:t>
       </w:r>
@@ -7221,6 +7396,7 @@
           <w:sz w:val="24"/>
           <w:highlight w:val="yellow"/>
           <w:u w:val="single"/>
+          <w:shd w:val="clear" w:color="auto" w:fill="FFFF00"/>
         </w:rPr>
         <w:t>loads</w:t>
       </w:r>
@@ -7399,6 +7575,7 @@
           <w:sz w:val="24"/>
           <w:highlight w:val="yellow"/>
           <w:u w:val="single"/>
+          <w:shd w:val="clear" w:color="auto" w:fill="FFFF00"/>
         </w:rPr>
         <w:t xml:space="preserve">moratorium </w:t>
       </w:r>
@@ -7461,6 +7638,7 @@
           <w:sz w:val="24"/>
           <w:highlight w:val="yellow"/>
           <w:u w:val="single"/>
+          <w:shd w:val="clear" w:color="auto" w:fill="FFFF00"/>
         </w:rPr>
         <w:t>permits</w:t>
       </w:r>
@@ -7478,6 +7656,7 @@
           <w:sz w:val="24"/>
           <w:highlight w:val="yellow"/>
           <w:u w:val="single"/>
+          <w:shd w:val="clear" w:color="auto" w:fill="FFFF00"/>
         </w:rPr>
         <w:t>build</w:t>
       </w:r>
@@ -7554,6 +7733,7 @@
           <w:sz w:val="24"/>
           <w:highlight w:val="yellow"/>
           <w:u w:val="single"/>
+          <w:shd w:val="clear" w:color="auto" w:fill="FFFF00"/>
         </w:rPr>
         <w:t>grid</w:t>
       </w:r>
@@ -7757,6 +7937,7 @@
           <w:sz w:val="24"/>
           <w:highlight w:val="yellow"/>
           <w:u w:val="single"/>
+          <w:shd w:val="clear" w:color="auto" w:fill="FFFF00"/>
         </w:rPr>
         <w:t>consistent standards</w:t>
       </w:r>
@@ -7864,6 +8045,7 @@
           <w:sz w:val="24"/>
           <w:highlight w:val="yellow"/>
           <w:u w:val="single"/>
+          <w:shd w:val="clear" w:color="auto" w:fill="FFFF00"/>
         </w:rPr>
         <w:t>Once</w:t>
       </w:r>
@@ -7888,6 +8070,7 @@
           <w:sz w:val="24"/>
           <w:highlight w:val="yellow"/>
           <w:u w:val="single"/>
+          <w:shd w:val="clear" w:color="auto" w:fill="FFFF00"/>
         </w:rPr>
         <w:t xml:space="preserve"> State finalizes</w:t>
       </w:r>
@@ -7919,6 +8102,7 @@
           <w:sz w:val="24"/>
           <w:highlight w:val="yellow"/>
           <w:u w:val="single"/>
+          <w:shd w:val="clear" w:color="auto" w:fill="FFFF00"/>
         </w:rPr>
         <w:t>standards</w:t>
       </w:r>
@@ -7943,6 +8127,7 @@
           <w:sz w:val="24"/>
           <w:highlight w:val="yellow"/>
           <w:u w:val="single"/>
+          <w:shd w:val="clear" w:color="auto" w:fill="FFFF00"/>
         </w:rPr>
         <w:t>moratorium</w:t>
       </w:r>
@@ -7988,6 +8173,7 @@
           <w:sz w:val="24"/>
           <w:highlight w:val="yellow"/>
           <w:u w:val="single"/>
+          <w:shd w:val="clear" w:color="auto" w:fill="FFFF00"/>
         </w:rPr>
         <w:t>lifted</w:t>
       </w:r>
@@ -8363,6 +8549,7 @@
           <w:sz w:val="24"/>
           <w:highlight w:val="yellow"/>
           <w:u w:val="single"/>
+          <w:shd w:val="clear" w:color="auto" w:fill="FFFF00"/>
         </w:rPr>
         <w:t>require</w:t>
       </w:r>
@@ -8394,6 +8581,7 @@
           <w:sz w:val="24"/>
           <w:highlight w:val="yellow"/>
           <w:u w:val="single"/>
+          <w:shd w:val="clear" w:color="auto" w:fill="FFFF00"/>
         </w:rPr>
         <w:t>centers to invest in</w:t>
       </w:r>
@@ -8425,6 +8613,7 @@
           <w:sz w:val="24"/>
           <w:highlight w:val="yellow"/>
           <w:u w:val="single"/>
+          <w:shd w:val="clear" w:color="auto" w:fill="FFFF00"/>
         </w:rPr>
         <w:t>grid infrastructure</w:t>
       </w:r>
@@ -8449,6 +8638,7 @@
           <w:sz w:val="24"/>
           <w:highlight w:val="yellow"/>
           <w:u w:val="single"/>
+          <w:shd w:val="clear" w:color="auto" w:fill="FFFF00"/>
         </w:rPr>
         <w:t>support</w:t>
       </w:r>
@@ -8481,6 +8671,7 @@
           <w:sz w:val="24"/>
           <w:highlight w:val="yellow"/>
           <w:u w:val="single"/>
+          <w:shd w:val="clear" w:color="auto" w:fill="FFFF00"/>
         </w:rPr>
         <w:t>clean energy</w:t>
       </w:r>
@@ -8734,6 +8925,7 @@
           <w:sz w:val="24"/>
           <w:highlight w:val="yellow"/>
           <w:u w:val="single"/>
+          <w:shd w:val="clear" w:color="auto" w:fill="FFFF00"/>
         </w:rPr>
         <w:t>there is no AI without energy</w:t>
       </w:r>
@@ -8822,6 +9014,7 @@
           <w:sz w:val="24"/>
           <w:highlight w:val="yellow"/>
           <w:u w:val="single"/>
+          <w:shd w:val="clear" w:color="auto" w:fill="FFFF00"/>
         </w:rPr>
         <w:t>The energy sector is therefore at the heart of one of the most important technological</w:t>
       </w:r>
@@ -8840,6 +9033,7 @@
           <w:sz w:val="24"/>
           <w:highlight w:val="yellow"/>
           <w:u w:val="single"/>
+          <w:shd w:val="clear" w:color="auto" w:fill="FFFF00"/>
         </w:rPr>
         <w:t>revolutions today</w:t>
       </w:r>
@@ -9040,6 +9234,7 @@
           <w:sz w:val="24"/>
           <w:highlight w:val="yellow"/>
           <w:u w:val="single"/>
+          <w:shd w:val="clear" w:color="auto" w:fill="FFFF00"/>
         </w:rPr>
         <w:t>Electricity demand for data centres more than doubles by 2030</w:t>
       </w:r>
@@ -9089,6 +9284,7 @@
           <w:sz w:val="24"/>
           <w:highlight w:val="yellow"/>
           <w:u w:val="single"/>
+          <w:shd w:val="clear" w:color="auto" w:fill="FFFF00"/>
         </w:rPr>
         <w:t>Data centres are one of several drivers of accelerated electricity demand growth in the Age of</w:t>
       </w:r>
@@ -9107,6 +9303,7 @@
           <w:sz w:val="24"/>
           <w:highlight w:val="yellow"/>
           <w:u w:val="single"/>
+          <w:shd w:val="clear" w:color="auto" w:fill="FFFF00"/>
         </w:rPr>
         <w:t>Electricity</w:t>
       </w:r>
@@ -9316,6 +9513,7 @@
           <w:sz w:val="24"/>
           <w:highlight w:val="yellow"/>
           <w:u w:val="single"/>
+          <w:shd w:val="clear" w:color="auto" w:fill="FFFF00"/>
         </w:rPr>
         <w:t>has</w:t>
       </w:r>
@@ -9334,6 +9532,7 @@
           <w:sz w:val="24"/>
           <w:highlight w:val="yellow"/>
           <w:u w:val="single"/>
+          <w:shd w:val="clear" w:color="auto" w:fill="FFFF00"/>
         </w:rPr>
         <w:t>potential</w:t>
       </w:r>
@@ -9352,6 +9551,7 @@
           <w:sz w:val="24"/>
           <w:highlight w:val="yellow"/>
           <w:u w:val="single"/>
+          <w:shd w:val="clear" w:color="auto" w:fill="FFFF00"/>
         </w:rPr>
         <w:t>to</w:t>
       </w:r>
@@ -9370,6 +9570,7 @@
           <w:sz w:val="24"/>
           <w:highlight w:val="yellow"/>
           <w:u w:val="single"/>
+          <w:shd w:val="clear" w:color="auto" w:fill="FFFF00"/>
         </w:rPr>
         <w:t>grow</w:t>
       </w:r>
@@ -9388,6 +9589,7 @@
           <w:sz w:val="24"/>
           <w:highlight w:val="yellow"/>
           <w:u w:val="single"/>
+          <w:shd w:val="clear" w:color="auto" w:fill="FFFF00"/>
         </w:rPr>
         <w:t>from</w:t>
       </w:r>
@@ -9406,6 +9608,7 @@
           <w:sz w:val="24"/>
           <w:highlight w:val="yellow"/>
           <w:u w:val="single"/>
+          <w:shd w:val="clear" w:color="auto" w:fill="FFFF00"/>
         </w:rPr>
         <w:t>trillion</w:t>
       </w:r>
@@ -9431,6 +9634,7 @@
           <w:sz w:val="24"/>
           <w:highlight w:val="yellow"/>
           <w:u w:val="single"/>
+          <w:shd w:val="clear" w:color="auto" w:fill="FFFF00"/>
         </w:rPr>
         <w:t>market</w:t>
       </w:r>
@@ -9449,6 +9653,7 @@
           <w:sz w:val="24"/>
           <w:highlight w:val="yellow"/>
           <w:u w:val="single"/>
+          <w:shd w:val="clear" w:color="auto" w:fill="FFFF00"/>
         </w:rPr>
         <w:t>to</w:t>
       </w:r>
@@ -9467,6 +9672,7 @@
           <w:sz w:val="24"/>
           <w:highlight w:val="yellow"/>
           <w:u w:val="single"/>
+          <w:shd w:val="clear" w:color="auto" w:fill="FFFF00"/>
         </w:rPr>
         <w:t>15</w:t>
       </w:r>
@@ -9485,6 +9691,7 @@
           <w:sz w:val="24"/>
           <w:highlight w:val="yellow"/>
           <w:u w:val="single"/>
+          <w:shd w:val="clear" w:color="auto" w:fill="FFFF00"/>
         </w:rPr>
         <w:t>trillion</w:t>
       </w:r>
@@ -9503,6 +9710,7 @@
           <w:sz w:val="24"/>
           <w:highlight w:val="yellow"/>
           <w:u w:val="single"/>
+          <w:shd w:val="clear" w:color="auto" w:fill="FFFF00"/>
         </w:rPr>
         <w:t>market</w:t>
       </w:r>
@@ -9521,6 +9729,7 @@
           <w:sz w:val="24"/>
           <w:highlight w:val="yellow"/>
           <w:u w:val="single"/>
+          <w:shd w:val="clear" w:color="auto" w:fill="FFFF00"/>
         </w:rPr>
         <w:t>This</w:t>
       </w:r>
@@ -9539,6 +9748,7 @@
           <w:sz w:val="24"/>
           <w:highlight w:val="yellow"/>
           <w:u w:val="single"/>
+          <w:shd w:val="clear" w:color="auto" w:fill="FFFF00"/>
         </w:rPr>
         <w:t>emphasizes</w:t>
       </w:r>
@@ -9564,6 +9774,7 @@
           <w:sz w:val="24"/>
           <w:highlight w:val="yellow"/>
           <w:u w:val="single"/>
+          <w:shd w:val="clear" w:color="auto" w:fill="FFFF00"/>
         </w:rPr>
         <w:t>importance</w:t>
       </w:r>
@@ -9582,6 +9793,7 @@
           <w:sz w:val="24"/>
           <w:highlight w:val="yellow"/>
           <w:u w:val="single"/>
+          <w:shd w:val="clear" w:color="auto" w:fill="FFFF00"/>
         </w:rPr>
         <w:t>of</w:t>
       </w:r>
@@ -9600,6 +9812,7 @@
           <w:sz w:val="24"/>
           <w:highlight w:val="yellow"/>
           <w:u w:val="single"/>
+          <w:shd w:val="clear" w:color="auto" w:fill="FFFF00"/>
         </w:rPr>
         <w:t>the</w:t>
       </w:r>
@@ -9618,6 +9831,7 @@
           <w:sz w:val="24"/>
           <w:highlight w:val="yellow"/>
           <w:u w:val="single"/>
+          <w:shd w:val="clear" w:color="auto" w:fill="FFFF00"/>
         </w:rPr>
         <w:t>industry</w:t>
       </w:r>
@@ -9636,6 +9850,7 @@
           <w:sz w:val="24"/>
           <w:highlight w:val="yellow"/>
           <w:u w:val="single"/>
+          <w:shd w:val="clear" w:color="auto" w:fill="FFFF00"/>
         </w:rPr>
         <w:t>and</w:t>
       </w:r>
@@ -9654,6 +9869,7 @@
           <w:sz w:val="24"/>
           <w:highlight w:val="yellow"/>
           <w:u w:val="single"/>
+          <w:shd w:val="clear" w:color="auto" w:fill="FFFF00"/>
         </w:rPr>
         <w:t>this</w:t>
       </w:r>
@@ -9672,6 +9888,7 @@
           <w:sz w:val="24"/>
           <w:highlight w:val="yellow"/>
           <w:u w:val="single"/>
+          <w:shd w:val="clear" w:color="auto" w:fill="FFFF00"/>
         </w:rPr>
         <w:t>should</w:t>
       </w:r>
@@ -9690,6 +9907,7 @@
           <w:sz w:val="24"/>
           <w:highlight w:val="yellow"/>
           <w:u w:val="single"/>
+          <w:shd w:val="clear" w:color="auto" w:fill="FFFF00"/>
         </w:rPr>
         <w:t>be</w:t>
       </w:r>
@@ -9708,6 +9926,7 @@
           <w:sz w:val="24"/>
           <w:highlight w:val="yellow"/>
           <w:u w:val="single"/>
+          <w:shd w:val="clear" w:color="auto" w:fill="FFFF00"/>
         </w:rPr>
         <w:t>kept</w:t>
       </w:r>
@@ -9726,6 +9945,7 @@
           <w:sz w:val="24"/>
           <w:highlight w:val="yellow"/>
           <w:u w:val="single"/>
+          <w:shd w:val="clear" w:color="auto" w:fill="FFFF00"/>
         </w:rPr>
         <w:t>domestically</w:t>
       </w:r>
@@ -9744,6 +9964,7 @@
           <w:sz w:val="24"/>
           <w:highlight w:val="yellow"/>
           <w:u w:val="single"/>
+          <w:shd w:val="clear" w:color="auto" w:fill="FFFF00"/>
         </w:rPr>
         <w:t>through</w:t>
       </w:r>
@@ -9769,6 +9990,7 @@
           <w:sz w:val="24"/>
           <w:highlight w:val="yellow"/>
           <w:u w:val="single"/>
+          <w:shd w:val="clear" w:color="auto" w:fill="FFFF00"/>
         </w:rPr>
         <w:t>straightforward</w:t>
       </w:r>
@@ -9787,6 +10009,7 @@
           <w:sz w:val="24"/>
           <w:highlight w:val="yellow"/>
           <w:u w:val="single"/>
+          <w:shd w:val="clear" w:color="auto" w:fill="FFFF00"/>
         </w:rPr>
         <w:t>patent</w:t>
       </w:r>
@@ -9805,6 +10028,7 @@
           <w:sz w:val="24"/>
           <w:highlight w:val="yellow"/>
           <w:u w:val="single"/>
+          <w:shd w:val="clear" w:color="auto" w:fill="FFFF00"/>
         </w:rPr>
         <w:t>issuing</w:t>
       </w:r>
@@ -9823,6 +10047,7 @@
           <w:sz w:val="24"/>
           <w:highlight w:val="yellow"/>
           <w:u w:val="single"/>
+          <w:shd w:val="clear" w:color="auto" w:fill="FFFF00"/>
         </w:rPr>
         <w:t>to</w:t>
       </w:r>
@@ -9841,6 +10066,7 @@
           <w:sz w:val="24"/>
           <w:highlight w:val="yellow"/>
           <w:u w:val="single"/>
+          <w:shd w:val="clear" w:color="auto" w:fill="FFFF00"/>
         </w:rPr>
         <w:t>encourage</w:t>
       </w:r>
@@ -9859,6 +10085,7 @@
           <w:sz w:val="24"/>
           <w:highlight w:val="yellow"/>
           <w:u w:val="single"/>
+          <w:shd w:val="clear" w:color="auto" w:fill="FFFF00"/>
         </w:rPr>
         <w:t>innovation</w:t>
       </w:r>

</xml_diff>